<commit_message>
fix(documents): pied de page des avenants en tableau (alignement à droite, pagination)
Réf / Page x/y et Pour … / Pour Audencia Junior Conseil dans un tableau sans bordure
pour tenir dans les visionneuses qui ignorent les tabulations ; valeurs de pagination
figées ramenées à 2 pages. Modèles en prod (rupture, RDM, convention d'étude).

Co-Authored-By: Claude Sonnet 5.5 <noreply@anthropic.com>
</commit_message>
<xml_diff>
--- a/docs/modeles/avenant-convention-etude-befast-v1.docx
+++ b/docs/modeles/avenant-convention-etude-befast-v1.docx
@@ -1362,195 +1362,217 @@
       <w:t>Tous droits de reproduction réservés</w:t>
     </w:r>
   </w:p>
-  <w:p>
-    <w:pPr>
-      <w:pStyle w:val="Footer"/>
-      <w:pBdr>
-        <w:top w:val="single" w:sz="4" w:space="1" w:color="000000"/>
-      </w:pBdr>
-      <w:tabs>
-        <w:tab w:val="clear" w:pos="4536"/>
-        <w:tab w:val="clear" w:pos="9072"/>
-        <w:tab w:val="right" w:pos="9900"/>
-      </w:tabs>
-      <w:spacing w:before="80"/>
-      <w:jc w:val="left"/>
-      <w:rPr>
-        <w:rFonts w:ascii="Century Gothic" w:eastAsia="Century Gothic" w:hAnsi="Century Gothic" w:cs="Century Gothic"/>
-        <w:sz w:val="16"/>
-        <w:szCs w:val="16"/>
-      </w:rPr>
-    </w:pPr>
-    <w:r>
-      <w:rPr>
-        <w:rFonts w:ascii="Century Gothic" w:eastAsia="Century Gothic" w:hAnsi="Century Gothic" w:cs="Century Gothic"/>
-        <w:color w:val="000000"/>
-        <w:sz w:val="16"/>
-        <w:szCs w:val="16"/>
-      </w:rPr>
-      <w:t xml:space="preserve">Réf : {reference_document}</w:t>
-    </w:r>
-    <w:r>
-      <w:rPr>
-        <w:rFonts w:ascii="Century Gothic" w:eastAsia="Century Gothic" w:hAnsi="Century Gothic" w:cs="Century Gothic"/>
-        <w:sz w:val="16"/>
-      </w:rPr>
-      <w:tab/>
-    </w:r>
-    <w:r>
-      <w:rPr>
-        <w:rFonts w:ascii="Century Gothic" w:eastAsia="Century Gothic" w:hAnsi="Century Gothic" w:cs="Century Gothic"/>
-        <w:color w:val="000000"/>
-        <w:sz w:val="16"/>
-        <w:szCs w:val="16"/>
-      </w:rPr>
-      <w:t xml:space="preserve">Page </w:t>
-    </w:r>
-    <w:r>
-      <w:rPr>
-        <w:rFonts w:ascii="Century Gothic" w:eastAsia="Century Gothic" w:hAnsi="Century Gothic" w:cs="Century Gothic"/>
-        <w:color w:val="000000"/>
-        <w:sz w:val="16"/>
-        <w:szCs w:val="16"/>
-      </w:rPr>
-      <w:fldChar w:fldCharType="begin"/>
-    </w:r>
-    <w:r>
-      <w:rPr>
-        <w:rFonts w:ascii="Century Gothic" w:eastAsia="Century Gothic" w:hAnsi="Century Gothic" w:cs="Century Gothic"/>
-        <w:color w:val="000000"/>
-        <w:sz w:val="16"/>
-        <w:szCs w:val="16"/>
-      </w:rPr>
-      <w:instrText xml:space="preserve"> PAGE </w:instrText>
-    </w:r>
-    <w:r>
-      <w:rPr>
-        <w:rFonts w:ascii="Century Gothic" w:eastAsia="Century Gothic" w:hAnsi="Century Gothic" w:cs="Century Gothic"/>
-        <w:color w:val="000000"/>
-        <w:sz w:val="16"/>
-        <w:szCs w:val="16"/>
-      </w:rPr>
-      <w:fldChar w:fldCharType="separate"/>
-    </w:r>
-    <w:r>
-      <w:rPr>
-        <w:rFonts w:ascii="Century Gothic" w:eastAsia="Century Gothic" w:hAnsi="Century Gothic" w:cs="Century Gothic"/>
-        <w:color w:val="000000"/>
-        <w:sz w:val="16"/>
-        <w:szCs w:val="16"/>
-      </w:rPr>
-      <w:t>1</w:t>
-    </w:r>
-    <w:r>
-      <w:rPr>
-        <w:rFonts w:ascii="Century Gothic" w:eastAsia="Century Gothic" w:hAnsi="Century Gothic" w:cs="Century Gothic"/>
-        <w:color w:val="000000"/>
-        <w:sz w:val="16"/>
-        <w:szCs w:val="16"/>
-      </w:rPr>
-      <w:fldChar w:fldCharType="end"/>
-    </w:r>
-    <w:r>
-      <w:rPr>
-        <w:rFonts w:ascii="Century Gothic" w:eastAsia="Century Gothic" w:hAnsi="Century Gothic" w:cs="Century Gothic"/>
-        <w:color w:val="000000"/>
-        <w:sz w:val="16"/>
-        <w:szCs w:val="16"/>
-      </w:rPr>
-      <w:t xml:space="preserve">/</w:t>
-    </w:r>
-    <w:r>
-      <w:rPr>
-        <w:rFonts w:ascii="Century Gothic" w:eastAsia="Century Gothic" w:hAnsi="Century Gothic" w:cs="Century Gothic"/>
-        <w:color w:val="000000"/>
-        <w:sz w:val="16"/>
-        <w:szCs w:val="16"/>
-      </w:rPr>
-      <w:fldChar w:fldCharType="begin"/>
-    </w:r>
-    <w:r>
-      <w:rPr>
-        <w:rFonts w:ascii="Century Gothic" w:eastAsia="Century Gothic" w:hAnsi="Century Gothic" w:cs="Century Gothic"/>
-        <w:color w:val="000000"/>
-        <w:sz w:val="16"/>
-        <w:szCs w:val="16"/>
-      </w:rPr>
-      <w:instrText xml:space="preserve"> NUMPAGES </w:instrText>
-    </w:r>
-    <w:r>
-      <w:rPr>
-        <w:rFonts w:ascii="Century Gothic" w:eastAsia="Century Gothic" w:hAnsi="Century Gothic" w:cs="Century Gothic"/>
-        <w:color w:val="000000"/>
-        <w:sz w:val="16"/>
-        <w:szCs w:val="16"/>
-      </w:rPr>
-      <w:fldChar w:fldCharType="separate"/>
-    </w:r>
-    <w:r>
-      <w:rPr>
-        <w:rFonts w:ascii="Century Gothic" w:eastAsia="Century Gothic" w:hAnsi="Century Gothic" w:cs="Century Gothic"/>
-        <w:color w:val="000000"/>
-        <w:sz w:val="16"/>
-        <w:szCs w:val="16"/>
-      </w:rPr>
-      <w:t>2</w:t>
-    </w:r>
-    <w:r>
-      <w:rPr>
-        <w:rFonts w:ascii="Century Gothic" w:eastAsia="Century Gothic" w:hAnsi="Century Gothic" w:cs="Century Gothic"/>
-        <w:color w:val="000000"/>
-        <w:sz w:val="16"/>
-        <w:szCs w:val="16"/>
-      </w:rPr>
-      <w:fldChar w:fldCharType="end"/>
-    </w:r>
-  </w:p>
-  <w:p>
-    <w:pPr>
-      <w:pStyle w:val="Footer"/>
-      <w:tabs>
-        <w:tab w:val="clear" w:pos="4536"/>
-        <w:tab w:val="clear" w:pos="9072"/>
-        <w:tab w:val="right" w:pos="9900"/>
-      </w:tabs>
-      <w:jc w:val="left"/>
-      <w:rPr>
-        <w:rFonts w:ascii="Century Gothic" w:eastAsia="Century Gothic" w:hAnsi="Century Gothic" w:cs="Century Gothic"/>
-        <w:sz w:val="16"/>
-        <w:szCs w:val="16"/>
-      </w:rPr>
-    </w:pPr>
-    <w:r>
-      <w:rPr>
-        <w:rFonts w:ascii="Century Gothic" w:eastAsia="Century Gothic" w:hAnsi="Century Gothic" w:cs="Century Gothic"/>
-        <w:b/>
-        <w:bCs/>
-        <w:color w:val="000000"/>
-        <w:sz w:val="16"/>
-        <w:szCs w:val="16"/>
-      </w:rPr>
-      <w:t xml:space="preserve">Pour {client.nom}</w:t>
-    </w:r>
-    <w:r>
-      <w:rPr>
-        <w:rFonts w:ascii="Century Gothic" w:eastAsia="Century Gothic" w:hAnsi="Century Gothic" w:cs="Century Gothic"/>
-        <w:sz w:val="16"/>
-      </w:rPr>
-      <w:tab/>
-    </w:r>
-    <w:r>
-      <w:rPr>
-        <w:rFonts w:ascii="Century Gothic" w:eastAsia="Century Gothic" w:hAnsi="Century Gothic" w:cs="Century Gothic"/>
-        <w:b/>
-        <w:bCs/>
-        <w:color w:val="000000"/>
-        <w:sz w:val="16"/>
-        <w:szCs w:val="16"/>
-      </w:rPr>
-      <w:t xml:space="preserve">Pour Audencia Junior Conseil</w:t>
-    </w:r>
-  </w:p>
+  <w:tbl>
+    <w:tblPr>
+      <w:tblW w:w="9890" w:type="dxa"/>
+      <w:tblLayout w:type="fixed"/>
+      <w:tblCellMar>
+        <w:left w:w="0" w:type="dxa"/>
+        <w:right w:w="0" w:type="dxa"/>
+      </w:tblCellMar>
+    </w:tblPr>
+    <w:tblGrid>
+      <w:gridCol w:w="4945"/>
+      <w:gridCol w:w="4945"/>
+    </w:tblGrid>
+    <w:tr>
+      <w:tc>
+        <w:tcPr>
+          <w:tcW w:w="4945" w:type="dxa"/>
+          <w:tcBorders>
+            <w:top w:val="single" w:sz="4" w:space="0" w:color="auto"/>
+          </w:tcBorders>
+        </w:tcPr>
+        <w:p>
+          <w:pPr>
+            <w:pStyle w:val="Footer"/>
+            <w:spacing w:before="80" w:after="0"/>
+            <w:jc w:val="left"/>
+          </w:pPr>
+          <w:r>
+            <w:rPr>
+              <w:rFonts w:ascii="Century Gothic" w:eastAsia="Century Gothic" w:hAnsi="Century Gothic" w:cs="Century Gothic"/>
+              <w:color w:val="000000"/>
+              <w:sz w:val="16"/>
+              <w:szCs w:val="16"/>
+            </w:rPr>
+            <w:t xml:space="preserve">Réf : {reference_document}</w:t>
+          </w:r>
+        </w:p>
+      </w:tc>
+      <w:tc>
+        <w:tcPr>
+          <w:tcW w:w="4945" w:type="dxa"/>
+          <w:tcBorders>
+            <w:top w:val="single" w:sz="4" w:space="0" w:color="auto"/>
+          </w:tcBorders>
+        </w:tcPr>
+        <w:p>
+          <w:pPr>
+            <w:pStyle w:val="Footer"/>
+            <w:spacing w:before="80" w:after="0"/>
+            <w:jc w:val="right"/>
+          </w:pPr>
+          <w:r>
+            <w:rPr>
+              <w:rFonts w:ascii="Century Gothic" w:eastAsia="Century Gothic" w:hAnsi="Century Gothic" w:cs="Century Gothic"/>
+              <w:color w:val="000000"/>
+              <w:sz w:val="16"/>
+              <w:szCs w:val="16"/>
+            </w:rPr>
+            <w:t xml:space="preserve">Page </w:t>
+          </w:r>
+          <w:r>
+            <w:rPr>
+              <w:rFonts w:ascii="Century Gothic" w:eastAsia="Century Gothic" w:hAnsi="Century Gothic" w:cs="Century Gothic"/>
+              <w:color w:val="000000"/>
+              <w:sz w:val="16"/>
+              <w:szCs w:val="16"/>
+            </w:rPr>
+            <w:fldChar w:fldCharType="begin"/>
+          </w:r>
+          <w:r>
+            <w:rPr>
+              <w:rFonts w:ascii="Century Gothic" w:eastAsia="Century Gothic" w:hAnsi="Century Gothic" w:cs="Century Gothic"/>
+              <w:color w:val="000000"/>
+              <w:sz w:val="16"/>
+              <w:szCs w:val="16"/>
+            </w:rPr>
+            <w:instrText xml:space="preserve"> PAGE </w:instrText>
+          </w:r>
+          <w:r>
+            <w:rPr>
+              <w:rFonts w:ascii="Century Gothic" w:eastAsia="Century Gothic" w:hAnsi="Century Gothic" w:cs="Century Gothic"/>
+              <w:color w:val="000000"/>
+              <w:sz w:val="16"/>
+              <w:szCs w:val="16"/>
+            </w:rPr>
+            <w:fldChar w:fldCharType="separate"/>
+          </w:r>
+          <w:r>
+            <w:rPr>
+              <w:rFonts w:ascii="Century Gothic" w:eastAsia="Century Gothic" w:hAnsi="Century Gothic" w:cs="Century Gothic"/>
+              <w:color w:val="000000"/>
+              <w:sz w:val="16"/>
+              <w:szCs w:val="16"/>
+            </w:rPr>
+            <w:t>2</w:t>
+          </w:r>
+          <w:r>
+            <w:rPr>
+              <w:rFonts w:ascii="Century Gothic" w:eastAsia="Century Gothic" w:hAnsi="Century Gothic" w:cs="Century Gothic"/>
+              <w:color w:val="000000"/>
+              <w:sz w:val="16"/>
+              <w:szCs w:val="16"/>
+            </w:rPr>
+            <w:fldChar w:fldCharType="end"/>
+          </w:r>
+          <w:r>
+            <w:rPr>
+              <w:rFonts w:ascii="Century Gothic" w:eastAsia="Century Gothic" w:hAnsi="Century Gothic" w:cs="Century Gothic"/>
+              <w:color w:val="000000"/>
+              <w:sz w:val="16"/>
+              <w:szCs w:val="16"/>
+            </w:rPr>
+            <w:t xml:space="preserve">/</w:t>
+          </w:r>
+          <w:r>
+            <w:rPr>
+              <w:rFonts w:ascii="Century Gothic" w:eastAsia="Century Gothic" w:hAnsi="Century Gothic" w:cs="Century Gothic"/>
+              <w:color w:val="000000"/>
+              <w:sz w:val="16"/>
+              <w:szCs w:val="16"/>
+            </w:rPr>
+            <w:fldChar w:fldCharType="begin"/>
+          </w:r>
+          <w:r>
+            <w:rPr>
+              <w:rFonts w:ascii="Century Gothic" w:eastAsia="Century Gothic" w:hAnsi="Century Gothic" w:cs="Century Gothic"/>
+              <w:color w:val="000000"/>
+              <w:sz w:val="16"/>
+              <w:szCs w:val="16"/>
+            </w:rPr>
+            <w:instrText xml:space="preserve"> NUMPAGES </w:instrText>
+          </w:r>
+          <w:r>
+            <w:rPr>
+              <w:rFonts w:ascii="Century Gothic" w:eastAsia="Century Gothic" w:hAnsi="Century Gothic" w:cs="Century Gothic"/>
+              <w:color w:val="000000"/>
+              <w:sz w:val="16"/>
+              <w:szCs w:val="16"/>
+            </w:rPr>
+            <w:fldChar w:fldCharType="separate"/>
+          </w:r>
+          <w:r>
+            <w:rPr>
+              <w:rFonts w:ascii="Century Gothic" w:eastAsia="Century Gothic" w:hAnsi="Century Gothic" w:cs="Century Gothic"/>
+              <w:color w:val="000000"/>
+              <w:sz w:val="16"/>
+              <w:szCs w:val="16"/>
+            </w:rPr>
+            <w:t>2</w:t>
+          </w:r>
+          <w:r>
+            <w:rPr>
+              <w:rFonts w:ascii="Century Gothic" w:eastAsia="Century Gothic" w:hAnsi="Century Gothic" w:cs="Century Gothic"/>
+              <w:color w:val="000000"/>
+              <w:sz w:val="16"/>
+              <w:szCs w:val="16"/>
+            </w:rPr>
+            <w:fldChar w:fldCharType="end"/>
+          </w:r>
+        </w:p>
+      </w:tc>
+    </w:tr>
+    <w:tr>
+      <w:tc>
+        <w:tcPr>
+          <w:tcW w:w="4945" w:type="dxa"/>
+        </w:tcPr>
+        <w:p>
+          <w:pPr>
+            <w:pStyle w:val="Footer"/>
+            <w:spacing w:before="80" w:after="0"/>
+            <w:jc w:val="left"/>
+          </w:pPr>
+          <w:r>
+            <w:rPr>
+              <w:rFonts w:ascii="Century Gothic" w:eastAsia="Century Gothic" w:hAnsi="Century Gothic" w:cs="Century Gothic"/>
+              <w:b/>
+              <w:bCs/>
+              <w:color w:val="000000"/>
+              <w:sz w:val="16"/>
+              <w:szCs w:val="16"/>
+            </w:rPr>
+            <w:t xml:space="preserve">Pour {client.nom}</w:t>
+          </w:r>
+        </w:p>
+      </w:tc>
+      <w:tc>
+        <w:tcPr>
+          <w:tcW w:w="4945" w:type="dxa"/>
+        </w:tcPr>
+        <w:p>
+          <w:pPr>
+            <w:pStyle w:val="Footer"/>
+            <w:spacing w:before="80" w:after="0"/>
+            <w:jc w:val="right"/>
+          </w:pPr>
+          <w:r>
+            <w:rPr>
+              <w:rFonts w:ascii="Century Gothic" w:eastAsia="Century Gothic" w:hAnsi="Century Gothic" w:cs="Century Gothic"/>
+              <w:b/>
+              <w:bCs/>
+              <w:color w:val="000000"/>
+              <w:sz w:val="16"/>
+              <w:szCs w:val="16"/>
+            </w:rPr>
+            <w:t xml:space="preserve">Pour Audencia Junior Conseil</w:t>
+          </w:r>
+        </w:p>
+      </w:tc>
+    </w:tr>
+  </w:tbl>
   <w:p>
     <w:pPr>
       <w:pStyle w:val="Footer"/>
@@ -1663,195 +1685,217 @@
       <w:t>Tous droits de reproduction réservés</w:t>
     </w:r>
   </w:p>
-  <w:p>
-    <w:pPr>
-      <w:pStyle w:val="Footer"/>
-      <w:pBdr>
-        <w:top w:val="single" w:sz="4" w:space="1" w:color="000000"/>
-      </w:pBdr>
-      <w:tabs>
-        <w:tab w:val="clear" w:pos="4536"/>
-        <w:tab w:val="clear" w:pos="9072"/>
-        <w:tab w:val="right" w:pos="9900"/>
-      </w:tabs>
-      <w:spacing w:before="80"/>
-      <w:jc w:val="left"/>
-      <w:rPr>
-        <w:rFonts w:ascii="Century Gothic" w:eastAsia="Century Gothic" w:hAnsi="Century Gothic" w:cs="Century Gothic"/>
-        <w:sz w:val="16"/>
-        <w:szCs w:val="16"/>
-      </w:rPr>
-    </w:pPr>
-    <w:r>
-      <w:rPr>
-        <w:rFonts w:ascii="Century Gothic" w:eastAsia="Century Gothic" w:hAnsi="Century Gothic" w:cs="Century Gothic"/>
-        <w:color w:val="000000"/>
-        <w:sz w:val="16"/>
-        <w:szCs w:val="16"/>
-      </w:rPr>
-      <w:t xml:space="preserve">Réf : {reference_document}</w:t>
-    </w:r>
-    <w:r>
-      <w:rPr>
-        <w:rFonts w:ascii="Century Gothic" w:eastAsia="Century Gothic" w:hAnsi="Century Gothic" w:cs="Century Gothic"/>
-        <w:sz w:val="16"/>
-      </w:rPr>
-      <w:tab/>
-    </w:r>
-    <w:r>
-      <w:rPr>
-        <w:rFonts w:ascii="Century Gothic" w:eastAsia="Century Gothic" w:hAnsi="Century Gothic" w:cs="Century Gothic"/>
-        <w:color w:val="000000"/>
-        <w:sz w:val="16"/>
-        <w:szCs w:val="16"/>
-      </w:rPr>
-      <w:t xml:space="preserve">Page </w:t>
-    </w:r>
-    <w:r>
-      <w:rPr>
-        <w:rFonts w:ascii="Century Gothic" w:eastAsia="Century Gothic" w:hAnsi="Century Gothic" w:cs="Century Gothic"/>
-        <w:color w:val="000000"/>
-        <w:sz w:val="16"/>
-        <w:szCs w:val="16"/>
-      </w:rPr>
-      <w:fldChar w:fldCharType="begin"/>
-    </w:r>
-    <w:r>
-      <w:rPr>
-        <w:rFonts w:ascii="Century Gothic" w:eastAsia="Century Gothic" w:hAnsi="Century Gothic" w:cs="Century Gothic"/>
-        <w:color w:val="000000"/>
-        <w:sz w:val="16"/>
-        <w:szCs w:val="16"/>
-      </w:rPr>
-      <w:instrText xml:space="preserve"> PAGE </w:instrText>
-    </w:r>
-    <w:r>
-      <w:rPr>
-        <w:rFonts w:ascii="Century Gothic" w:eastAsia="Century Gothic" w:hAnsi="Century Gothic" w:cs="Century Gothic"/>
-        <w:color w:val="000000"/>
-        <w:sz w:val="16"/>
-        <w:szCs w:val="16"/>
-      </w:rPr>
-      <w:fldChar w:fldCharType="separate"/>
-    </w:r>
-    <w:r>
-      <w:rPr>
-        <w:rFonts w:ascii="Century Gothic" w:eastAsia="Century Gothic" w:hAnsi="Century Gothic" w:cs="Century Gothic"/>
-        <w:color w:val="000000"/>
-        <w:sz w:val="16"/>
-        <w:szCs w:val="16"/>
-      </w:rPr>
-      <w:t>1</w:t>
-    </w:r>
-    <w:r>
-      <w:rPr>
-        <w:rFonts w:ascii="Century Gothic" w:eastAsia="Century Gothic" w:hAnsi="Century Gothic" w:cs="Century Gothic"/>
-        <w:color w:val="000000"/>
-        <w:sz w:val="16"/>
-        <w:szCs w:val="16"/>
-      </w:rPr>
-      <w:fldChar w:fldCharType="end"/>
-    </w:r>
-    <w:r>
-      <w:rPr>
-        <w:rFonts w:ascii="Century Gothic" w:eastAsia="Century Gothic" w:hAnsi="Century Gothic" w:cs="Century Gothic"/>
-        <w:color w:val="000000"/>
-        <w:sz w:val="16"/>
-        <w:szCs w:val="16"/>
-      </w:rPr>
-      <w:t xml:space="preserve">/</w:t>
-    </w:r>
-    <w:r>
-      <w:rPr>
-        <w:rFonts w:ascii="Century Gothic" w:eastAsia="Century Gothic" w:hAnsi="Century Gothic" w:cs="Century Gothic"/>
-        <w:color w:val="000000"/>
-        <w:sz w:val="16"/>
-        <w:szCs w:val="16"/>
-      </w:rPr>
-      <w:fldChar w:fldCharType="begin"/>
-    </w:r>
-    <w:r>
-      <w:rPr>
-        <w:rFonts w:ascii="Century Gothic" w:eastAsia="Century Gothic" w:hAnsi="Century Gothic" w:cs="Century Gothic"/>
-        <w:color w:val="000000"/>
-        <w:sz w:val="16"/>
-        <w:szCs w:val="16"/>
-      </w:rPr>
-      <w:instrText xml:space="preserve"> NUMPAGES </w:instrText>
-    </w:r>
-    <w:r>
-      <w:rPr>
-        <w:rFonts w:ascii="Century Gothic" w:eastAsia="Century Gothic" w:hAnsi="Century Gothic" w:cs="Century Gothic"/>
-        <w:color w:val="000000"/>
-        <w:sz w:val="16"/>
-        <w:szCs w:val="16"/>
-      </w:rPr>
-      <w:fldChar w:fldCharType="separate"/>
-    </w:r>
-    <w:r>
-      <w:rPr>
-        <w:rFonts w:ascii="Century Gothic" w:eastAsia="Century Gothic" w:hAnsi="Century Gothic" w:cs="Century Gothic"/>
-        <w:color w:val="000000"/>
-        <w:sz w:val="16"/>
-        <w:szCs w:val="16"/>
-      </w:rPr>
-      <w:t>2</w:t>
-    </w:r>
-    <w:r>
-      <w:rPr>
-        <w:rFonts w:ascii="Century Gothic" w:eastAsia="Century Gothic" w:hAnsi="Century Gothic" w:cs="Century Gothic"/>
-        <w:color w:val="000000"/>
-        <w:sz w:val="16"/>
-        <w:szCs w:val="16"/>
-      </w:rPr>
-      <w:fldChar w:fldCharType="end"/>
-    </w:r>
-  </w:p>
-  <w:p>
-    <w:pPr>
-      <w:pStyle w:val="Footer"/>
-      <w:tabs>
-        <w:tab w:val="clear" w:pos="4536"/>
-        <w:tab w:val="clear" w:pos="9072"/>
-        <w:tab w:val="right" w:pos="9900"/>
-      </w:tabs>
-      <w:jc w:val="left"/>
-      <w:rPr>
-        <w:rFonts w:ascii="Century Gothic" w:eastAsia="Century Gothic" w:hAnsi="Century Gothic" w:cs="Century Gothic"/>
-        <w:sz w:val="16"/>
-        <w:szCs w:val="16"/>
-      </w:rPr>
-    </w:pPr>
-    <w:r>
-      <w:rPr>
-        <w:rFonts w:ascii="Century Gothic" w:eastAsia="Century Gothic" w:hAnsi="Century Gothic" w:cs="Century Gothic"/>
-        <w:b/>
-        <w:bCs/>
-        <w:color w:val="000000"/>
-        <w:sz w:val="16"/>
-        <w:szCs w:val="16"/>
-      </w:rPr>
-      <w:t xml:space="preserve">Pour {client.nom}</w:t>
-    </w:r>
-    <w:r>
-      <w:rPr>
-        <w:rFonts w:ascii="Century Gothic" w:eastAsia="Century Gothic" w:hAnsi="Century Gothic" w:cs="Century Gothic"/>
-        <w:sz w:val="16"/>
-      </w:rPr>
-      <w:tab/>
-    </w:r>
-    <w:r>
-      <w:rPr>
-        <w:rFonts w:ascii="Century Gothic" w:eastAsia="Century Gothic" w:hAnsi="Century Gothic" w:cs="Century Gothic"/>
-        <w:b/>
-        <w:bCs/>
-        <w:color w:val="000000"/>
-        <w:sz w:val="16"/>
-        <w:szCs w:val="16"/>
-      </w:rPr>
-      <w:t xml:space="preserve">Pour Audencia Junior Conseil</w:t>
-    </w:r>
-  </w:p>
+  <w:tbl>
+    <w:tblPr>
+      <w:tblW w:w="9890" w:type="dxa"/>
+      <w:tblLayout w:type="fixed"/>
+      <w:tblCellMar>
+        <w:left w:w="0" w:type="dxa"/>
+        <w:right w:w="0" w:type="dxa"/>
+      </w:tblCellMar>
+    </w:tblPr>
+    <w:tblGrid>
+      <w:gridCol w:w="4945"/>
+      <w:gridCol w:w="4945"/>
+    </w:tblGrid>
+    <w:tr>
+      <w:tc>
+        <w:tcPr>
+          <w:tcW w:w="4945" w:type="dxa"/>
+          <w:tcBorders>
+            <w:top w:val="single" w:sz="4" w:space="0" w:color="auto"/>
+          </w:tcBorders>
+        </w:tcPr>
+        <w:p>
+          <w:pPr>
+            <w:pStyle w:val="Footer"/>
+            <w:spacing w:before="80" w:after="0"/>
+            <w:jc w:val="left"/>
+          </w:pPr>
+          <w:r>
+            <w:rPr>
+              <w:rFonts w:ascii="Century Gothic" w:eastAsia="Century Gothic" w:hAnsi="Century Gothic" w:cs="Century Gothic"/>
+              <w:color w:val="000000"/>
+              <w:sz w:val="16"/>
+              <w:szCs w:val="16"/>
+            </w:rPr>
+            <w:t xml:space="preserve">Réf : {reference_document}</w:t>
+          </w:r>
+        </w:p>
+      </w:tc>
+      <w:tc>
+        <w:tcPr>
+          <w:tcW w:w="4945" w:type="dxa"/>
+          <w:tcBorders>
+            <w:top w:val="single" w:sz="4" w:space="0" w:color="auto"/>
+          </w:tcBorders>
+        </w:tcPr>
+        <w:p>
+          <w:pPr>
+            <w:pStyle w:val="Footer"/>
+            <w:spacing w:before="80" w:after="0"/>
+            <w:jc w:val="right"/>
+          </w:pPr>
+          <w:r>
+            <w:rPr>
+              <w:rFonts w:ascii="Century Gothic" w:eastAsia="Century Gothic" w:hAnsi="Century Gothic" w:cs="Century Gothic"/>
+              <w:color w:val="000000"/>
+              <w:sz w:val="16"/>
+              <w:szCs w:val="16"/>
+            </w:rPr>
+            <w:t xml:space="preserve">Page </w:t>
+          </w:r>
+          <w:r>
+            <w:rPr>
+              <w:rFonts w:ascii="Century Gothic" w:eastAsia="Century Gothic" w:hAnsi="Century Gothic" w:cs="Century Gothic"/>
+              <w:color w:val="000000"/>
+              <w:sz w:val="16"/>
+              <w:szCs w:val="16"/>
+            </w:rPr>
+            <w:fldChar w:fldCharType="begin"/>
+          </w:r>
+          <w:r>
+            <w:rPr>
+              <w:rFonts w:ascii="Century Gothic" w:eastAsia="Century Gothic" w:hAnsi="Century Gothic" w:cs="Century Gothic"/>
+              <w:color w:val="000000"/>
+              <w:sz w:val="16"/>
+              <w:szCs w:val="16"/>
+            </w:rPr>
+            <w:instrText xml:space="preserve"> PAGE </w:instrText>
+          </w:r>
+          <w:r>
+            <w:rPr>
+              <w:rFonts w:ascii="Century Gothic" w:eastAsia="Century Gothic" w:hAnsi="Century Gothic" w:cs="Century Gothic"/>
+              <w:color w:val="000000"/>
+              <w:sz w:val="16"/>
+              <w:szCs w:val="16"/>
+            </w:rPr>
+            <w:fldChar w:fldCharType="separate"/>
+          </w:r>
+          <w:r>
+            <w:rPr>
+              <w:rFonts w:ascii="Century Gothic" w:eastAsia="Century Gothic" w:hAnsi="Century Gothic" w:cs="Century Gothic"/>
+              <w:color w:val="000000"/>
+              <w:sz w:val="16"/>
+              <w:szCs w:val="16"/>
+            </w:rPr>
+            <w:t>1</w:t>
+          </w:r>
+          <w:r>
+            <w:rPr>
+              <w:rFonts w:ascii="Century Gothic" w:eastAsia="Century Gothic" w:hAnsi="Century Gothic" w:cs="Century Gothic"/>
+              <w:color w:val="000000"/>
+              <w:sz w:val="16"/>
+              <w:szCs w:val="16"/>
+            </w:rPr>
+            <w:fldChar w:fldCharType="end"/>
+          </w:r>
+          <w:r>
+            <w:rPr>
+              <w:rFonts w:ascii="Century Gothic" w:eastAsia="Century Gothic" w:hAnsi="Century Gothic" w:cs="Century Gothic"/>
+              <w:color w:val="000000"/>
+              <w:sz w:val="16"/>
+              <w:szCs w:val="16"/>
+            </w:rPr>
+            <w:t xml:space="preserve">/</w:t>
+          </w:r>
+          <w:r>
+            <w:rPr>
+              <w:rFonts w:ascii="Century Gothic" w:eastAsia="Century Gothic" w:hAnsi="Century Gothic" w:cs="Century Gothic"/>
+              <w:color w:val="000000"/>
+              <w:sz w:val="16"/>
+              <w:szCs w:val="16"/>
+            </w:rPr>
+            <w:fldChar w:fldCharType="begin"/>
+          </w:r>
+          <w:r>
+            <w:rPr>
+              <w:rFonts w:ascii="Century Gothic" w:eastAsia="Century Gothic" w:hAnsi="Century Gothic" w:cs="Century Gothic"/>
+              <w:color w:val="000000"/>
+              <w:sz w:val="16"/>
+              <w:szCs w:val="16"/>
+            </w:rPr>
+            <w:instrText xml:space="preserve"> NUMPAGES </w:instrText>
+          </w:r>
+          <w:r>
+            <w:rPr>
+              <w:rFonts w:ascii="Century Gothic" w:eastAsia="Century Gothic" w:hAnsi="Century Gothic" w:cs="Century Gothic"/>
+              <w:color w:val="000000"/>
+              <w:sz w:val="16"/>
+              <w:szCs w:val="16"/>
+            </w:rPr>
+            <w:fldChar w:fldCharType="separate"/>
+          </w:r>
+          <w:r>
+            <w:rPr>
+              <w:rFonts w:ascii="Century Gothic" w:eastAsia="Century Gothic" w:hAnsi="Century Gothic" w:cs="Century Gothic"/>
+              <w:color w:val="000000"/>
+              <w:sz w:val="16"/>
+              <w:szCs w:val="16"/>
+            </w:rPr>
+            <w:t>2</w:t>
+          </w:r>
+          <w:r>
+            <w:rPr>
+              <w:rFonts w:ascii="Century Gothic" w:eastAsia="Century Gothic" w:hAnsi="Century Gothic" w:cs="Century Gothic"/>
+              <w:color w:val="000000"/>
+              <w:sz w:val="16"/>
+              <w:szCs w:val="16"/>
+            </w:rPr>
+            <w:fldChar w:fldCharType="end"/>
+          </w:r>
+        </w:p>
+      </w:tc>
+    </w:tr>
+    <w:tr>
+      <w:tc>
+        <w:tcPr>
+          <w:tcW w:w="4945" w:type="dxa"/>
+        </w:tcPr>
+        <w:p>
+          <w:pPr>
+            <w:pStyle w:val="Footer"/>
+            <w:spacing w:before="80" w:after="0"/>
+            <w:jc w:val="left"/>
+          </w:pPr>
+          <w:r>
+            <w:rPr>
+              <w:rFonts w:ascii="Century Gothic" w:eastAsia="Century Gothic" w:hAnsi="Century Gothic" w:cs="Century Gothic"/>
+              <w:b/>
+              <w:bCs/>
+              <w:color w:val="000000"/>
+              <w:sz w:val="16"/>
+              <w:szCs w:val="16"/>
+            </w:rPr>
+            <w:t xml:space="preserve">Pour {client.nom}</w:t>
+          </w:r>
+        </w:p>
+      </w:tc>
+      <w:tc>
+        <w:tcPr>
+          <w:tcW w:w="4945" w:type="dxa"/>
+        </w:tcPr>
+        <w:p>
+          <w:pPr>
+            <w:pStyle w:val="Footer"/>
+            <w:spacing w:before="80" w:after="0"/>
+            <w:jc w:val="right"/>
+          </w:pPr>
+          <w:r>
+            <w:rPr>
+              <w:rFonts w:ascii="Century Gothic" w:eastAsia="Century Gothic" w:hAnsi="Century Gothic" w:cs="Century Gothic"/>
+              <w:b/>
+              <w:bCs/>
+              <w:color w:val="000000"/>
+              <w:sz w:val="16"/>
+              <w:szCs w:val="16"/>
+            </w:rPr>
+            <w:t xml:space="preserve">Pour Audencia Junior Conseil</w:t>
+          </w:r>
+        </w:p>
+      </w:tc>
+    </w:tr>
+  </w:tbl>
   <w:p>
     <w:pPr>
       <w:pStyle w:val="Footer"/>

</xml_diff>